<commit_message>
updating to newer version
</commit_message>
<xml_diff>
--- a/external_documents/teaching/Teaching Philosophy.docx
+++ b/external_documents/teaching/Teaching Philosophy.docx
@@ -1,39 +1,257 @@
 
 <file path=word/document.xml><?xml version="1.0" encoding="utf-8"?>
-<w:document xmlns:wpc="http://schemas.microsoft.com/office/word/2010/wordprocessingCanvas" xmlns:cx="http://schemas.microsoft.com/office/drawing/2014/chartex" xmlns:cx1="http://schemas.microsoft.com/office/drawing/2015/9/8/chartex" xmlns:cx2="http://schemas.microsoft.com/office/drawing/2015/10/21/chartex" xmlns:cx3="http://schemas.microsoft.com/office/drawing/2016/5/9/chartex" xmlns:cx4="http://schemas.microsoft.com/office/drawing/2016/5/10/chartex" xmlns:cx5="http://schemas.microsoft.com/office/drawing/2016/5/11/chartex" xmlns:cx6="http://schemas.microsoft.com/office/drawing/2016/5/12/chartex" xmlns:cx7="http://schemas.microsoft.com/office/drawing/2016/5/13/chartex" xmlns:cx8="http://schemas.microsoft.com/office/drawing/2016/5/14/chartex" xmlns:mc="http://schemas.openxmlformats.org/markup-compatibility/2006" xmlns:aink="http://schemas.microsoft.com/office/drawing/2016/ink" xmlns:am3d="http://schemas.microsoft.com/office/drawing/2017/model3d" xmlns:o="urn:schemas-microsoft-com:office:office" xmlns:oel="http://schemas.microsoft.com/office/2019/extlst" xmlns:r="http://schemas.openxmlformats.org/officeDocument/2006/relationships" xmlns:m="http://schemas.openxmlformats.org/officeDocument/2006/math" xmlns:v="urn:schemas-microsoft-com:vml" xmlns:wp14="http://schemas.microsoft.com/office/word/2010/wordprocessingDrawing" xmlns:wp="http://schemas.openxmlformats.org/drawingml/2006/wordprocessingDrawing" xmlns:w10="urn:schemas-microsoft-com:office:word" xmlns:w="http://schemas.openxmlformats.org/wordprocessingml/2006/main" xmlns:w14="http://schemas.microsoft.com/office/word/2010/wordml" xmlns:w15="http://schemas.microsoft.com/office/word/2012/wordml" xmlns:w16cex="http://schemas.microsoft.com/office/word/2018/wordml/cex" xmlns:w16cid="http://schemas.microsoft.com/office/word/2016/wordml/cid" xmlns:w16="http://schemas.microsoft.com/office/word/2018/wordml" xmlns:w16du="http://schemas.microsoft.com/office/word/2023/wordml/word16du" xmlns:w16sdtdh="http://schemas.microsoft.com/office/word/2020/wordml/sdtdatahash" xmlns:w16sdtfl="http://schemas.microsoft.com/office/word/2024/wordml/sdtformatlock" xmlns:w16se="http://schemas.microsoft.com/office/word/2015/wordml/symex" xmlns:wpg="http://schemas.microsoft.com/office/word/2010/wordprocessingGroup" xmlns:wpi="http://schemas.microsoft.com/office/word/2010/wordprocessingInk" xmlns:wne="http://schemas.microsoft.com/office/word/2006/wordml" xmlns:wps="http://schemas.microsoft.com/office/word/2010/wordprocessingShape" mc:Ignorable="w14 w15 w16se w16cid w16 w16cex w16sdtdh w16sdtfl w16du wp14">
+<w:document xmlns:wpc="http://schemas.microsoft.com/office/word/2010/wordprocessingCanvas" xmlns:cx="http://schemas.microsoft.com/office/drawing/2014/chartex" xmlns:cx1="http://schemas.microsoft.com/office/drawing/2015/9/8/chartex" xmlns:cx2="http://schemas.microsoft.com/office/drawing/2015/10/21/chartex" xmlns:cx3="http://schemas.microsoft.com/office/drawing/2016/5/9/chartex" xmlns:cx4="http://schemas.microsoft.com/office/drawing/2016/5/10/chartex" xmlns:cx5="http://schemas.microsoft.com/office/drawing/2016/5/11/chartex" xmlns:cx6="http://schemas.microsoft.com/office/drawing/2016/5/12/chartex" xmlns:cx7="http://schemas.microsoft.com/office/drawing/2016/5/13/chartex" xmlns:cx8="http://schemas.microsoft.com/office/drawing/2016/5/14/chartex" xmlns:mc="http://schemas.openxmlformats.org/markup-compatibility/2006" xmlns:m="http://schemas.openxmlformats.org/officeDocument/2006/math" xmlns:aink="http://schemas.microsoft.com/office/drawing/2016/ink" xmlns:am3d="http://schemas.microsoft.com/office/drawing/2017/model3d" xmlns:oel="http://schemas.microsoft.com/office/2019/extlst" xmlns:r="http://schemas.openxmlformats.org/officeDocument/2006/relationships" xmlns:wp14="http://schemas.microsoft.com/office/word/2010/wordprocessingDrawing" xmlns:wp="http://schemas.openxmlformats.org/drawingml/2006/wordprocessingDrawing" xmlns:wpg="http://schemas.microsoft.com/office/word/2010/wordprocessingGroup" xmlns:wpi="http://schemas.microsoft.com/office/word/2010/wordprocessingInk" xmlns:wps="http://schemas.microsoft.com/office/word/2010/wordprocessingShape" xmlns:o="urn:schemas-microsoft-com:office:office" xmlns:v="urn:schemas-microsoft-com:vml" xmlns:w10="urn:schemas-microsoft-com:office:word" xmlns:w="http://schemas.openxmlformats.org/wordprocessingml/2006/main" xmlns:w14="http://schemas.microsoft.com/office/word/2010/wordml" xmlns:w15="http://schemas.microsoft.com/office/word/2012/wordml" xmlns:w16cex="http://schemas.microsoft.com/office/word/2018/wordml/cex" xmlns:w16cid="http://schemas.microsoft.com/office/word/2016/wordml/cid" xmlns:w16="http://schemas.microsoft.com/office/word/2018/wordml" xmlns:w16sdtdh="http://schemas.microsoft.com/office/word/2020/wordml/sdtdatahash" xmlns:w16sdtfl="http://schemas.microsoft.com/office/word/2024/wordml/sdtformatlock" xmlns:w16se="http://schemas.microsoft.com/office/word/2015/wordml/symex" xmlns:w16du="http://schemas.microsoft.com/office/word/2023/wordml/word16du" xmlns:wne="http://schemas.microsoft.com/office/word/2006/wordml" mc:Ignorable="w14 w15 w16se w16cid w16 w16cex w16sdtdh w16sdtfl w16du wp14">
   <w:body>
-    <w:p/>
     <w:p>
+      <w:pPr>
+        <w:rPr>
+          <w:rFonts w:ascii="Times New Roman" w:eastAsia="Times New Roman" w:hAnsi="Times New Roman"/>
+          <w:b/>
+          <w:bCs/>
+          <w:kern w:val="0"/>
+          <w:szCs w:val="24"/>
+          <w14:ligatures w14:val="none"/>
+        </w:rPr>
+      </w:pPr>
       <w:r>
-        <w:t xml:space="preserve">In my online business and hospitality courses, student engagement is at the core of effective learning. I </w:t>
+        <w:t> </w:t>
       </w:r>
       <w:r>
-        <w:t>will utilize</w:t>
+        <w:rPr>
+          <w:rFonts w:ascii="Times New Roman" w:eastAsia="Times New Roman" w:hAnsi="Times New Roman"/>
+          <w:b/>
+          <w:bCs/>
+          <w:kern w:val="0"/>
+          <w:szCs w:val="24"/>
+          <w14:ligatures w14:val="none"/>
+        </w:rPr>
+        <w:t>Introduction: Purpose and Student-Centered Engagement</w:t>
+      </w:r>
+    </w:p>
+    <w:p>
+      <w:pPr>
+        <w:rPr>
+          <w:rFonts w:ascii="Times New Roman" w:hAnsi="Times New Roman"/>
+        </w:rPr>
+      </w:pPr>
+    </w:p>
+    <w:p>
+      <w:pPr>
+        <w:rPr>
+          <w:rFonts w:ascii="Times New Roman" w:eastAsia="Times New Roman" w:hAnsi="Times New Roman"/>
+          <w:kern w:val="0"/>
+          <w:szCs w:val="24"/>
+          <w14:ligatures w14:val="none"/>
+        </w:rPr>
+      </w:pPr>
+      <w:r>
+        <w:rPr>
+          <w:rFonts w:ascii="Times New Roman" w:eastAsia="Times New Roman" w:hAnsi="Times New Roman"/>
+          <w:kern w:val="0"/>
+          <w:szCs w:val="24"/>
+          <w14:ligatures w14:val="none"/>
+        </w:rPr>
+        <w:t>In my online business courses, such as Introduction to Business (BUSN105), student engagement and real-world relevance form the core of effective learning. My goal is to transform the virtual classroom into a dynamic, collaborative environment where students connect foundational theory to industry practice.</w:t>
+      </w:r>
+    </w:p>
+    <w:p>
+      <w:pPr>
+        <w:rPr>
+          <w:rFonts w:ascii="Times New Roman" w:eastAsia="Times New Roman" w:hAnsi="Times New Roman"/>
+          <w:kern w:val="0"/>
+          <w:szCs w:val="24"/>
+          <w14:ligatures w14:val="none"/>
+        </w:rPr>
+      </w:pPr>
+    </w:p>
+    <w:p>
+      <w:pPr>
+        <w:rPr>
+          <w:rFonts w:ascii="Times New Roman" w:eastAsia="Times New Roman" w:hAnsi="Times New Roman"/>
+          <w:b/>
+          <w:bCs/>
+          <w:kern w:val="0"/>
+          <w:szCs w:val="24"/>
+          <w14:ligatures w14:val="none"/>
+        </w:rPr>
+      </w:pPr>
+      <w:r>
+        <w:rPr>
+          <w:rFonts w:ascii="Times New Roman" w:hAnsi="Times New Roman"/>
+        </w:rPr>
+        <w:t> </w:t>
       </w:r>
       <w:r>
-        <w:t xml:space="preserve"> a variety of interactive strategies to make the virtual environment dynamic, collaborative, and relevant to industry practice. Students participate in regular discussion forums, where they analyze real-world case studies and share professional perspectives, fostering peer learning and critical thinking.</w:t>
+        <w:rPr>
+          <w:rFonts w:ascii="Times New Roman" w:eastAsia="Times New Roman" w:hAnsi="Times New Roman"/>
+          <w:b/>
+          <w:bCs/>
+          <w:kern w:val="0"/>
+          <w:szCs w:val="24"/>
+          <w14:ligatures w14:val="none"/>
+        </w:rPr>
+        <w:t>Active Learning and Core Business Concepts</w:t>
       </w:r>
     </w:p>
-    <w:p/>
     <w:p>
+      <w:pPr>
+        <w:rPr>
+          <w:rFonts w:ascii="Times New Roman" w:hAnsi="Times New Roman"/>
+        </w:rPr>
+      </w:pPr>
+    </w:p>
+    <w:p>
+      <w:pPr>
+        <w:rPr>
+          <w:rFonts w:ascii="Times New Roman" w:eastAsia="Times New Roman" w:hAnsi="Times New Roman"/>
+          <w:kern w:val="0"/>
+          <w:szCs w:val="24"/>
+          <w14:ligatures w14:val="none"/>
+        </w:rPr>
+      </w:pPr>
       <w:r>
-        <w:t>I also use multimedia assignments—such as video presentations, digital marketing analyses, and interactive simulations—to allow students to demonstrate understanding in diverse ways and build confidence with industry tools. Frequent, targeted feedback via annotated rubrics and one-on-one virtual office hours ensures that every student receives personalized support and guidance throughout the course.</w:t>
+        <w:rPr>
+          <w:rFonts w:ascii="Times New Roman" w:eastAsia="Times New Roman" w:hAnsi="Times New Roman"/>
+          <w:kern w:val="0"/>
+          <w:szCs w:val="24"/>
+          <w14:ligatures w14:val="none"/>
+        </w:rPr>
+        <w:t>To address diverse learning objectives—ranging from management strategies and financial environments to marketing mix principles—I utilize a blend of interactive platforms and structured assignments. Students analyze business environments through guided coursework and interactive modules (such as Intellipath), ensuring they build technical fluency alongside theoretical comprehension.</w:t>
       </w:r>
     </w:p>
-    <w:p/>
     <w:p>
+      <w:pPr>
+        <w:rPr>
+          <w:rFonts w:ascii="Times New Roman" w:eastAsia="Times New Roman" w:hAnsi="Times New Roman"/>
+          <w:kern w:val="0"/>
+          <w:szCs w:val="24"/>
+          <w14:ligatures w14:val="none"/>
+        </w:rPr>
+      </w:pPr>
+    </w:p>
+    <w:p>
+      <w:pPr>
+        <w:rPr>
+          <w:rFonts w:ascii="Times New Roman" w:eastAsia="Times New Roman" w:hAnsi="Times New Roman"/>
+          <w:b/>
+          <w:bCs/>
+          <w:kern w:val="0"/>
+          <w:szCs w:val="24"/>
+          <w14:ligatures w14:val="none"/>
+        </w:rPr>
+      </w:pPr>
       <w:r>
-        <w:t>Finally, leveraging business and hospitality analytics tools, students engage in data-driven decision-making exercises and reflect on outcomes via self-assessment and group review sessions. These structured interactions help foster a sense of community and support diverse learning preferences, all while preparing students to thrive in the digital-first business and hospitality workforce.</w:t>
+        <w:rPr>
+          <w:rFonts w:ascii="Times New Roman" w:eastAsia="Times New Roman" w:hAnsi="Times New Roman"/>
+          <w:b/>
+          <w:bCs/>
+          <w:kern w:val="0"/>
+          <w:szCs w:val="24"/>
+          <w14:ligatures w14:val="none"/>
+        </w:rPr>
+        <w:t>Collaborative Discourse and Critical Thinking</w:t>
       </w:r>
     </w:p>
-    <w:p/>
-    <w:p/>
     <w:p>
+      <w:pPr>
+        <w:rPr>
+          <w:rFonts w:ascii="Times New Roman" w:hAnsi="Times New Roman"/>
+        </w:rPr>
+      </w:pPr>
       <w:r>
-        <w:t>This approach combines industry-relevant engagement tactics, robust online collaboration, and personalized digital instruction to drive learning outcomes in online business and hospitality education.</w:t>
+        <w:rPr>
+          <w:rFonts w:ascii="Times New Roman" w:hAnsi="Times New Roman"/>
+        </w:rPr>
+        <w:t> </w:t>
       </w:r>
     </w:p>
-    <w:p/>
+    <w:p>
+      <w:pPr>
+        <w:rPr>
+          <w:rFonts w:ascii="Times New Roman" w:eastAsia="Times New Roman" w:hAnsi="Times New Roman"/>
+          <w:kern w:val="0"/>
+          <w:szCs w:val="24"/>
+          <w14:ligatures w14:val="none"/>
+        </w:rPr>
+      </w:pPr>
+      <w:r>
+        <w:rPr>
+          <w:rFonts w:ascii="Times New Roman" w:eastAsia="Times New Roman" w:hAnsi="Times New Roman"/>
+          <w:kern w:val="0"/>
+          <w:szCs w:val="24"/>
+          <w14:ligatures w14:val="none"/>
+        </w:rPr>
+        <w:t>Fostering professional communication and critical thinking is central to my pedagogy. Through structured discussion boards, I encourage students to move beyond surface-level summaries by requiring complete responses, evidence from learning resources, and substantive peer dialogue. These exchanges allow learners to share professional perspectives, evaluate competing viewpoints, and construct collaborative insights.</w:t>
+      </w:r>
+    </w:p>
+    <w:p>
+      <w:pPr>
+        <w:rPr>
+          <w:rFonts w:ascii="Times New Roman" w:eastAsia="Times New Roman" w:hAnsi="Times New Roman"/>
+          <w:kern w:val="0"/>
+          <w:szCs w:val="24"/>
+          <w14:ligatures w14:val="none"/>
+        </w:rPr>
+      </w:pPr>
+    </w:p>
+    <w:p>
+      <w:pPr>
+        <w:rPr>
+          <w:rFonts w:ascii="Times New Roman" w:eastAsia="Times New Roman" w:hAnsi="Times New Roman"/>
+          <w:b/>
+          <w:bCs/>
+          <w:kern w:val="0"/>
+          <w:szCs w:val="24"/>
+          <w14:ligatures w14:val="none"/>
+        </w:rPr>
+      </w:pPr>
+      <w:r>
+        <w:rPr>
+          <w:rFonts w:ascii="Times New Roman" w:eastAsia="Times New Roman" w:hAnsi="Times New Roman"/>
+          <w:b/>
+          <w:bCs/>
+          <w:kern w:val="0"/>
+          <w:szCs w:val="24"/>
+          <w14:ligatures w14:val="none"/>
+        </w:rPr>
+        <w:t>Formative Assessment and Mentorship</w:t>
+      </w:r>
+    </w:p>
+    <w:p>
+      <w:pPr>
+        <w:rPr>
+          <w:rFonts w:ascii="Times New Roman" w:hAnsi="Times New Roman"/>
+        </w:rPr>
+      </w:pPr>
+      <w:r>
+        <w:rPr>
+          <w:rFonts w:ascii="Times New Roman" w:hAnsi="Times New Roman"/>
+        </w:rPr>
+        <w:t> </w:t>
+      </w:r>
+    </w:p>
+    <w:p>
+      <w:pPr>
+        <w:rPr>
+          <w:rFonts w:ascii="Times New Roman" w:hAnsi="Times New Roman"/>
+        </w:rPr>
+      </w:pPr>
+      <w:r>
+        <w:rPr>
+          <w:rFonts w:ascii="Times New Roman" w:eastAsia="Times New Roman" w:hAnsi="Times New Roman"/>
+          <w:kern w:val="0"/>
+          <w:szCs w:val="24"/>
+          <w14:ligatures w14:val="none"/>
+        </w:rPr>
+        <w:t xml:space="preserve">Meaningful assessment requires continuous, transparent guidance. I utilize targeted feedback via annotated rubrics and maintain accessible virtual office hours to ensure every student receives personalized academic support. By combining industry-aligned frameworks with rigorous digital instruction, I prepare students to navigate the complexities of the modern business and hospitality workforce.  </w:t>
+      </w:r>
+      <w:r>
+        <w:rPr>
+          <w:rFonts w:ascii="Times New Roman" w:hAnsi="Times New Roman"/>
+        </w:rPr>
+        <w:t xml:space="preserve"> </w:t>
+      </w:r>
+    </w:p>
     <w:p/>
     <w:sectPr>
       <w:pgSz w:w="12240" w:h="15840"/>
@@ -46,7 +264,7 @@
 </file>
 
 <file path=word/styles.xml><?xml version="1.0" encoding="utf-8"?>
-<w:styles xmlns:mc="http://schemas.openxmlformats.org/markup-compatibility/2006" xmlns:r="http://schemas.openxmlformats.org/officeDocument/2006/relationships" xmlns:w="http://schemas.openxmlformats.org/wordprocessingml/2006/main" xmlns:w14="http://schemas.microsoft.com/office/word/2010/wordml" xmlns:w15="http://schemas.microsoft.com/office/word/2012/wordml" xmlns:w16cex="http://schemas.microsoft.com/office/word/2018/wordml/cex" xmlns:w16cid="http://schemas.microsoft.com/office/word/2016/wordml/cid" xmlns:w16="http://schemas.microsoft.com/office/word/2018/wordml" xmlns:w16du="http://schemas.microsoft.com/office/word/2023/wordml/word16du" xmlns:w16sdtdh="http://schemas.microsoft.com/office/word/2020/wordml/sdtdatahash" xmlns:w16sdtfl="http://schemas.microsoft.com/office/word/2024/wordml/sdtformatlock" xmlns:w16se="http://schemas.microsoft.com/office/word/2015/wordml/symex" mc:Ignorable="w14 w15 w16se w16cid w16 w16cex w16sdtdh w16sdtfl w16du">
+<w:styles xmlns:mc="http://schemas.openxmlformats.org/markup-compatibility/2006" xmlns:r="http://schemas.openxmlformats.org/officeDocument/2006/relationships" xmlns:w="http://schemas.openxmlformats.org/wordprocessingml/2006/main" xmlns:w14="http://schemas.microsoft.com/office/word/2010/wordml" xmlns:w15="http://schemas.microsoft.com/office/word/2012/wordml" xmlns:w16cex="http://schemas.microsoft.com/office/word/2018/wordml/cex" xmlns:w16cid="http://schemas.microsoft.com/office/word/2016/wordml/cid" xmlns:w16="http://schemas.microsoft.com/office/word/2018/wordml" xmlns:w16sdtdh="http://schemas.microsoft.com/office/word/2020/wordml/sdtdatahash" xmlns:w16sdtfl="http://schemas.microsoft.com/office/word/2024/wordml/sdtformatlock" xmlns:w16se="http://schemas.microsoft.com/office/word/2015/wordml/symex" xmlns:w16du="http://schemas.microsoft.com/office/word/2023/wordml/word16du" mc:Ignorable="w14 w15 w16se w16cid w16 w16cex w16sdtdh w16sdtfl w16du">
   <w:docDefaults>
     <w:rPrDefault>
       <w:rPr>

</xml_diff>